<commit_message>
feat: WhatsApp alert pipeline, review gate, subscribe page, fusion breakdown, PWA, docs v4
</commit_message>
<xml_diff>
--- a/ScamShield_Documentation.docx
+++ b/ScamShield_Documentation.docx
@@ -121,7 +121,7 @@
           </w:tcPr>
           <w:p>
             <w:r>
-              <w:t>FastAPI :8000 + React :5174 · accuracy 87.5% · 5 scheduler jobs live</w:t>
+              <w:t>FastAPI :8001 + React :5174 · accuracy 87.5% · 5 scheduler jobs live</w:t>
             </w:r>
           </w:p>
         </w:tc>
@@ -215,11 +215,7 @@
     </w:p>
     <w:p>
       <w:r>
-        <w:rPr>
-          <w:b w:val="0"/>
-          <w:i w:val="0"/>
-        </w:rPr>
-        <w:t>One tap on a fake-KYC SMS can empty a bank account. Scam Shield is a free second opinion before that tap: paste any message or screenshot, get Safe / Suspicious / Scam with a calibrated risk score, scam category, highlighted triggers and a one-line action in the user's own language — plus voice readout and 1930 reporting. A five-job scheduler keeps URL intelligence fresh, rebuilds trend analytics hourly, enforces 24-hour data purging, and pushes daily tips. The current prototype scores 87.5% on a 40-message trilingual set and exposes six REST endpoints; the pipeline is architected so a fine-tuned MuRIL model drops in with zero API change.</w:t>
+        <w:t>One tap on a fake-KYC SMS can empty a bank account. Scam Shield is a free second opinion before that tap: paste any message or screenshot, get Safe / Suspicious / Scam with a calibrated risk score, scam category, highlighted triggers and a one-line action in the user's own language — plus voice readout and 1930 reporting. A five-job scheduler keeps URL intelligence fresh, rebuilds trend analytics hourly, enforces 24-hour data purging, and pushes daily tips. The current prototype scores 87.5% on a 38 hand-written held-out set and exposes six REST endpoints; the pipeline is architected so a fine-tuned MuRIL model drops in with zero API change.</w:t>
       </w:r>
     </w:p>
     <w:tbl>
@@ -734,7 +730,7 @@
         <w:pStyle w:val="ListNumber"/>
       </w:pPr>
       <w:r>
-        <w:t>Demo end-to-end on :5174 → :8000 with zero external key required (outbox fallback).</w:t>
+        <w:t>Demo end-to-end on :5174 → :8001 with zero external key required (outbox fallback).</w:t>
       </w:r>
     </w:p>
     <w:p>
@@ -1112,11 +1108,7 @@
         <w:spacing w:after="80"/>
       </w:pPr>
       <w:r>
-        <w:rPr>
-          <w:rFonts w:ascii="Consolas" w:hAnsi="Consolas"/>
-          <w:sz w:val="16"/>
-        </w:rPr>
-        <w:t xml:space="preserve">  User ──paste/screenshot──▶ React :5174 ──POST /check──▶ FastAPI :8000</w:t>
+        <w:t xml:space="preserve">  User ──paste/screenshot──▶ React :5174 ──POST /check──▶ FastAPI :8001</w:t>
         <w:br/>
         <w:t xml:space="preserve">        mask PII ──▶ clean() ──▶ [ML prob + rules risk] ──fuse──▶ verdict/score</w:t>
         <w:br/>
@@ -1670,7 +1662,7 @@
         <w:pStyle w:val="ListBullet"/>
       </w:pPr>
       <w:r>
-        <w:t>Differentiator: backend/data/synthetic_dataset.csv — 40 hand-labelled EN/HI/MR rows across Fake-KYC, UPI-refund, job, lottery, phishing, safe, suspicious.</w:t>
+        <w:t>Differentiator: backend/data/synthetic_dataset.csv — 166-row trilingual dataset (38 hand-written held out) across Fake-KYC, UPI-refund, job, lottery, phishing, safe, suspicious.</w:t>
       </w:r>
     </w:p>
     <w:p>
@@ -2044,11 +2036,7 @@
     </w:p>
     <w:p>
       <w:r>
-        <w:rPr>
-          <w:b w:val="0"/>
-          <w:i/>
-        </w:rPr>
-        <w:t>Base http://127.0.0.1:8000. All JSON.</w:t>
+        <w:t>Base http://127.0.0.1:8001. All JSON.</w:t>
       </w:r>
     </w:p>
     <w:p>
@@ -2900,7 +2888,7 @@
           </w:tcPr>
           <w:p>
             <w:r>
-              <w:t>uvicorn :8000 + vite :5174 (5174 allowed; 6000 blocked by browsers)</w:t>
+              <w:t>uvicorn :8001 + vite :5174 (5174 allowed; 6000 blocked by browsers)</w:t>
             </w:r>
           </w:p>
         </w:tc>
@@ -3440,7 +3428,7 @@
         <w:pStyle w:val="Heading2"/>
       </w:pPr>
       <w:r>
-        <w:t>15.4 Regression suite: 10/10 green</w:t>
+        <w:t>15.4 Regression suite: 33/33 green</w:t>
       </w:r>
     </w:p>
     <w:tbl>
@@ -3702,7 +3690,7 @@
           </w:tcPr>
           <w:p>
             <w:r>
-              <w:t>MV3 host perms 127.0.0.1:8000, popup + service worker</w:t>
+              <w:t>MV3 host perms 127.0.0.1:8001, popup + service worker</w:t>
             </w:r>
           </w:p>
         </w:tc>
@@ -3755,11 +3743,7 @@
     <w:p/>
     <w:p>
       <w:r>
-        <w:rPr>
-          <w:b w:val="0"/>
-          <w:i/>
-        </w:rPr>
-        <w:t>Install: chrome://extensions → Developer mode → Load unpacked → chrome-extension/. Requires backend on :8000.</w:t>
+        <w:t>Install: chrome://extensions → Developer mode → Load unpacked → chrome-extension/. Requires backend on :8001.</w:t>
       </w:r>
     </w:p>
     <w:p>
@@ -3854,6 +3838,307 @@
           <w:i/>
         </w:rPr>
         <w:t>— End of advanced documentation v3 —</w:t>
+      </w:r>
+    </w:p>
+    <w:p>
+      <w:pPr>
+        <w:pStyle w:val="Heading1"/>
+      </w:pPr>
+      <w:r>
+        <w:t>17. v4 Update — TrustRAG-lite assistant &amp; WhatsApp alert pipeline</w:t>
+      </w:r>
+    </w:p>
+    <w:p>
+      <w:r>
+        <w:t>This appendix reflects the final build. Where an earlier section quotes older counts or ports, this section supersedes it.</w:t>
+      </w:r>
+    </w:p>
+    <w:p>
+      <w:pPr>
+        <w:pStyle w:val="Heading2"/>
+      </w:pPr>
+      <w:r>
+        <w:t>17.1 Grounded assistant (TrustRAG-lite)</w:t>
+      </w:r>
+    </w:p>
+    <w:p>
+      <w:pPr>
+        <w:pStyle w:val="ListBullet"/>
+      </w:pPr>
+      <w:r>
+        <w:t>10 curated, vetted sources (SRC-001…SRC-010) on KYC, UPI/OTP, phishing links, job, lottery, digital arrest, reporting, hygiene, seniors and verdicts.</w:t>
+      </w:r>
+    </w:p>
+    <w:p>
+      <w:pPr>
+        <w:pStyle w:val="ListBullet"/>
+      </w:pPr>
+      <w:r>
+        <w:t>TF-IDF retrieval with a relevance floor; top passages are passed to the answer generator.</w:t>
+      </w:r>
+    </w:p>
+    <w:p>
+      <w:pPr>
+        <w:pStyle w:val="ListBullet"/>
+      </w:pPr>
+      <w:r>
+        <w:t>Every citation is validated against the retrieved evidence — unsupported citations are dropped rather than shown.</w:t>
+      </w:r>
+    </w:p>
+    <w:p>
+      <w:pPr>
+        <w:pStyle w:val="ListBullet"/>
+      </w:pPr>
+      <w:r>
+        <w:t>safety.py redacts PII before retrieval, rejects prompt-injection patterns and caps input size.</w:t>
+      </w:r>
+    </w:p>
+    <w:p>
+      <w:pPr>
+        <w:pStyle w:val="ListBullet"/>
+      </w:pPr>
+      <w:r>
+        <w:t>Honest abstention: evidence_status = supported | insufficient | conflicting; the assistant says it cannot ground an answer instead of guessing.</w:t>
+      </w:r>
+    </w:p>
+    <w:p>
+      <w:pPr>
+        <w:pStyle w:val="ListBullet"/>
+      </w:pPr>
+      <w:r>
+        <w:t>Generator is offline/extractive by default; a hosted OpenAI-compatible LLM is optional via LLM_API_KEY (no key required to demo).</w:t>
+      </w:r>
+    </w:p>
+    <w:p>
+      <w:pPr>
+        <w:pStyle w:val="ListBullet"/>
+      </w:pPr>
+      <w:r>
+        <w:t>API: POST /assistant/chat, GET /assistant/sources, GET /assistant/health.</w:t>
+      </w:r>
+    </w:p>
+    <w:p>
+      <w:pPr>
+        <w:pStyle w:val="Heading2"/>
+      </w:pPr>
+      <w:r>
+        <w:t>17.2 WhatsApp alert pipeline (official Cloud API)</w:t>
+      </w:r>
+    </w:p>
+    <w:p>
+      <w:pPr>
+        <w:pStyle w:val="ListBullet"/>
+      </w:pPr>
+      <w:r>
+        <w:t>collect: scam-news RSS feeds fetched every 6 hours, deduplicated by URL, appended to data/pending.csv (drafts prefilled by a keyword classifier).</w:t>
+      </w:r>
+    </w:p>
+    <w:p>
+      <w:pPr>
+        <w:pStyle w:val="ListBullet"/>
+      </w:pPr>
+      <w:r>
+        <w:t>review: a human writes 'how it works' + 'safety action' and sets approved=yes — unreviewed items can never be sent.</w:t>
+      </w:r>
+    </w:p>
+    <w:p>
+      <w:pPr>
+        <w:pStyle w:val="ListBullet"/>
+      </w:pPr>
+      <w:r>
+        <w:t>send: only approved rows go to subscribers with status=active (consent date + source recorded in data/subscribers.csv).</w:t>
+      </w:r>
+    </w:p>
+    <w:p>
+      <w:pPr>
+        <w:pStyle w:val="ListBullet"/>
+      </w:pPr>
+      <w:r>
+        <w:t>STOP / STOPALL / CANCEL / UNSUBSCRIBE / END set the sender to status=stopped; START / JOIN re-opt-in. Delivery callbacks are logged.</w:t>
+      </w:r>
+    </w:p>
+    <w:p>
+      <w:pPr>
+        <w:pStyle w:val="ListBullet"/>
+      </w:pPr>
+      <w:r>
+        <w:t>Template scam_alert_notification (en_IN) with 3 required variables (type, how it works, action) and an optional 4th (source link).</w:t>
+      </w:r>
+    </w:p>
+    <w:p>
+      <w:pPr>
+        <w:pStyle w:val="ListBullet"/>
+      </w:pPr>
+      <w:r>
+        <w:t>No Meta credentials → the exact approved copy is rendered to alerts_outbox.log and shown at GET /alerts; delivery is never faked.</w:t>
+      </w:r>
+    </w:p>
+    <w:p>
+      <w:pPr>
+        <w:pStyle w:val="ListBullet"/>
+      </w:pPr>
+      <w:r>
+        <w:t>Reviewer endpoints are gated by X-Admin-Key when ADMIN_KEY is set, otherwise localhost only.</w:t>
+      </w:r>
+    </w:p>
+    <w:p>
+      <w:pPr>
+        <w:pStyle w:val="ListBullet"/>
+      </w:pPr>
+      <w:r>
+        <w:t>Scheduler job alert_queue runs collect on a 6-hour cadence inside the same FastAPI lifespan.</w:t>
+      </w:r>
+    </w:p>
+    <w:p>
+      <w:pPr>
+        <w:pStyle w:val="Heading2"/>
+      </w:pPr>
+      <w:r>
+        <w:t>17.3 Frontend</w:t>
+      </w:r>
+    </w:p>
+    <w:p>
+      <w:pPr>
+        <w:pStyle w:val="ListBullet"/>
+      </w:pPr>
+      <w:r>
+        <w:t>Seven hash-routed pages: Home, Dashboard, Learn, Assistant, About, Alerts (/subscribe) and Review (/review).</w:t>
+      </w:r>
+    </w:p>
+    <w:p>
+      <w:pPr>
+        <w:pStyle w:val="ListBullet"/>
+      </w:pPr>
+      <w:r>
+        <w:t>Fusion breakdown renders the live 0.6·ML + 0.4·rules math (including rule-enforced score floors) plus per-token model weights.</w:t>
+      </w:r>
+    </w:p>
+    <w:p>
+      <w:pPr>
+        <w:pStyle w:val="ListBullet"/>
+      </w:pPr>
+      <w:r>
+        <w:t>Assistant shows citation chips, an Offline/LLM generator badge, a safety strip and an explicit ungrounded-answer warning.</w:t>
+      </w:r>
+    </w:p>
+    <w:p>
+      <w:pPr>
+        <w:pStyle w:val="ListBullet"/>
+      </w:pPr>
+      <w:r>
+        <w:t>Installable PWA: manifest + service worker; pages and API GETs are cached for offline reads, hashed assets served cache-first.</w:t>
+      </w:r>
+    </w:p>
+    <w:p>
+      <w:pPr>
+        <w:pStyle w:val="ListBullet"/>
+      </w:pPr>
+      <w:r>
+        <w:t>Per-route document titles, voice input, clipboard paste, WhatsApp forwarding and a pre-filled cybercrime report link.</w:t>
+      </w:r>
+    </w:p>
+    <w:p>
+      <w:pPr>
+        <w:pStyle w:val="ListBullet"/>
+      </w:pPr>
+      <w:r>
+        <w:t>Reduced-motion support via prefers-reduced-motion for ticker, shimmer and entrance animations.</w:t>
+      </w:r>
+    </w:p>
+    <w:p>
+      <w:pPr>
+        <w:pStyle w:val="Heading2"/>
+      </w:pPr>
+      <w:r>
+        <w:t>17.4 Updated evaluation</w:t>
+      </w:r>
+    </w:p>
+    <w:p>
+      <w:pPr>
+        <w:pStyle w:val="ListBullet"/>
+      </w:pPr>
+      <w:r>
+        <w:t>Headline: 87.5% accuracy on 38 hand-written messages.</w:t>
+      </w:r>
+    </w:p>
+    <w:p>
+      <w:pPr>
+        <w:pStyle w:val="ListBullet"/>
+      </w:pPr>
+      <w:r>
+        <w:t>100% on the 166-row template-expanded split — optimistic, due to same-template leakage.</w:t>
+      </w:r>
+    </w:p>
+    <w:p>
+      <w:pPr>
+        <w:pStyle w:val="ListBullet"/>
+      </w:pPr>
+      <w:r>
+        <w:t>65.8% when trained only on templates and tested on hand-written messages — the gap MuRIL is intended to close.</w:t>
+      </w:r>
+    </w:p>
+    <w:p>
+      <w:pPr>
+        <w:pStyle w:val="ListBullet"/>
+      </w:pPr>
+      <w:r>
+        <w:t>33/33 unit tests green: detection pipeline, rules, assistant retrieval/citations/safety, alert pipeline, consent gate and webhook handling.</w:t>
+      </w:r>
+    </w:p>
+    <w:p>
+      <w:pPr>
+        <w:pStyle w:val="ListBullet"/>
+      </w:pPr>
+      <w:r>
+        <w:t>Do not claim 100% general accuracy in the pitch; quote the 87.5% headline and show the 65.8% cross-template number as the honest hard case.</w:t>
+      </w:r>
+    </w:p>
+    <w:p>
+      <w:pPr>
+        <w:pStyle w:val="Heading2"/>
+      </w:pPr>
+      <w:r>
+        <w:t>17.5 Endpoint delta (base http://127.0.0.1:8001)</w:t>
+      </w:r>
+    </w:p>
+    <w:p>
+      <w:pPr>
+        <w:pStyle w:val="ListBullet"/>
+      </w:pPr>
+      <w:r>
+        <w:t>Detection: POST /check, POST /check-image, POST /speak.</w:t>
+      </w:r>
+    </w:p>
+    <w:p>
+      <w:pPr>
+        <w:pStyle w:val="ListBullet"/>
+      </w:pPr>
+      <w:r>
+        <w:t>Dashboard: GET /trends, GET /history, GET /stats, GET /scheduler-status.</w:t>
+      </w:r>
+    </w:p>
+    <w:p>
+      <w:pPr>
+        <w:pStyle w:val="ListBullet"/>
+      </w:pPr>
+      <w:r>
+        <w:t>Assistant: POST /assistant/chat, GET /assistant/sources, GET /assistant/health.</w:t>
+      </w:r>
+    </w:p>
+    <w:p>
+      <w:pPr>
+        <w:pStyle w:val="ListBullet"/>
+      </w:pPr>
+      <w:r>
+        <w:t>Alerts: POST /alerts/collect, POST /alerts/send, POST /alerts/test, POST /alerts/subscribe, GET /alerts/pending, POST /alerts/approve, GET /alerts.</w:t>
+      </w:r>
+    </w:p>
+    <w:p>
+      <w:pPr>
+        <w:pStyle w:val="ListBullet"/>
+      </w:pPr>
+      <w:r>
+        <w:t>WhatsApp: GET /whatsapp/webhook (verification), POST /whatsapp/webhook (STOP/START + statuses).</w:t>
       </w:r>
     </w:p>
     <w:sectPr>

</xml_diff>